<commit_message>
docs: add App Description section to Word project report and sync user file changes
</commit_message>
<xml_diff>
--- a/study_tracker_project_report.docx
+++ b/study_tracker_project_report.docx
@@ -95,6 +95,95 @@
       </w:pPr>
       <w:r>
         <w:t>The system incorporates automated playlist tokenization, YouTube Data API metadata parsing, and two distinct scheduling models (Greedy Hours packing and Balanced Day Partitioning). Additionally, it integrates an interactive embedded video workspace featuring one-click timestamp bookmarking and instant player seeking. By dynamically shifting calendars and recalculating workloads during plan pauses or deviation adjustments, Study Tracker eliminates scheduling overhead and empowers students to sustain productive, structured study habits.</w:t>
+      </w:r>
+    </w:p>
+    <w:p>
+      <w:r>
+        <w:br w:type="page"/>
+      </w:r>
+    </w:p>
+    <w:p>
+      <w:pPr>
+        <w:pStyle w:val="Heading1"/>
+        <w:keepNext/>
+        <w:spacing w:before="360" w:after="160"/>
+      </w:pPr>
+      <w:r>
+        <w:rPr>
+          <w:rFonts w:ascii="Arial" w:hAnsi="Arial"/>
+          <w:b/>
+          <w:color w:val="6D28D9"/>
+        </w:rPr>
+        <w:t>Application Design &amp; Layout Description</w:t>
+      </w:r>
+    </w:p>
+    <w:p>
+      <w:r>
+        <w:t>Study Tracker stands out by replacing standard corporate flat UI layouts with a warm, modern hand-drawn 'doodle' sketch style. This visual metaphor mimics a student's study notebook, making study planning feel organic, tactile, and less intimidating.</w:t>
+      </w:r>
+    </w:p>
+    <w:p>
+      <w:pPr>
+        <w:pStyle w:val="ListBullet"/>
+        <w:spacing w:after="160"/>
+      </w:pPr>
+      <w:r>
+        <w:rPr>
+          <w:b/>
+          <w:color w:val="6D28D9"/>
+        </w:rPr>
+        <w:t xml:space="preserve">Hand-Drawn Notebook Aesthetic: </w:t>
+      </w:r>
+      <w:r>
+        <w:t>The visual theme uses rough sketch borders (simulating graphite pencil lines), hand-drawn buttons, custom checkmarks, and paper tape labels. Lined grid backgrounds and card containers resemble real spiral-bound notebooks.</w:t>
+      </w:r>
+    </w:p>
+    <w:p>
+      <w:pPr>
+        <w:pStyle w:val="ListBullet"/>
+        <w:spacing w:after="160"/>
+      </w:pPr>
+      <w:r>
+        <w:rPr>
+          <w:b/>
+          <w:color w:val="6D28D9"/>
+        </w:rPr>
+        <w:t xml:space="preserve">Navigation &amp; Sidebar Layout: </w:t>
+      </w:r>
+      <w:r>
+        <w:t>Features a persistent left-aligned sidebar on desktop (toggling to a top header on mobile) styled like tabbed binder index dividers, keeping all subjects and settings accessible with one click.</w:t>
+      </w:r>
+    </w:p>
+    <w:p>
+      <w:pPr>
+        <w:pStyle w:val="ListBullet"/>
+        <w:spacing w:after="160"/>
+      </w:pPr>
+      <w:r>
+        <w:rPr>
+          <w:b/>
+          <w:color w:val="6D28D9"/>
+        </w:rPr>
+        <w:t xml:space="preserve">Folder Tabbed Interface: </w:t>
+      </w:r>
+      <w:r>
+        <w:t>Workspace pages are logically divided into tabbed cards (Lectures, Study Planner, Progress Chart, AI Notes) that sit flush with the folder boundary, simulating folder indexes.</w:t>
+      </w:r>
+    </w:p>
+    <w:p>
+      <w:pPr>
+        <w:pStyle w:val="ListBullet"/>
+        <w:spacing w:after="160"/>
+      </w:pPr>
+      <w:r>
+        <w:rPr>
+          <w:b/>
+          <w:color w:val="6D28D9"/>
+        </w:rPr>
+        <w:t xml:space="preserve">Lecture Workspace &amp; Split-Screen Display: </w:t>
+      </w:r>
+      <w:r>
+        <w:t>Selecting a video activates the main lecture workspace. The layout partitions into a 60/45 split-screen: the left side renders a custom TV-frame housing the YouTube player, and the right side opens a pinned timestamp-bookmark notebook panel for active note-taking.</w:t>
       </w:r>
     </w:p>
     <w:p>

</xml_diff>